<commit_message>
implemented MJMPE test features with boundary bias fixes
</commit_message>
<xml_diff>
--- a/Documentation/Comparative Evaluation of Vision-Based Finger Tracking for Piano Interaction.docx
+++ b/Documentation/Comparative Evaluation of Vision-Based Finger Tracking for Piano Interaction.docx
@@ -3707,7 +3707,7 @@
                     </pic:cNvPicPr>
                   </pic:nvPicPr>
                   <pic:blipFill>
-                    <a:blip r:embed="rId7">
+                    <a:blip r:embed="rId8">
                       <a:extLst>
                         <a:ext uri="{28A0092B-C50C-407E-A947-70E740481C1C}">
                           <a14:useLocalDpi xmlns:a14="http://schemas.microsoft.com/office/drawing/2010/main" val="0"/>
@@ -4208,21 +4208,7 @@
         <w:rPr>
           <w:rFonts w:ascii="Arial" w:hAnsi="Arial" w:cs="Arial"/>
         </w:rPr>
-        <w:t xml:space="preserve"> that OpenPose achieved higher accuracy than other lighter models in multi person scenarios at the cost of computing power. OpenPose has a notable limitation on CPU performance falling below 15-20 FPS and lack of temporal smoothing features. In a piano setting the lack of temporal smoothing might cause keypress false flags which directly </w:t>
-      </w:r>
-      <w:proofErr w:type="gramStart"/>
-      <w:r>
-        <w:rPr>
-          <w:rFonts w:ascii="Arial" w:hAnsi="Arial" w:cs="Arial"/>
-        </w:rPr>
-        <w:t>entails</w:t>
-      </w:r>
-      <w:proofErr w:type="gramEnd"/>
-      <w:r>
-        <w:rPr>
-          <w:rFonts w:ascii="Arial" w:hAnsi="Arial" w:cs="Arial"/>
-        </w:rPr>
-        <w:t xml:space="preserve"> accuracy reduction.</w:t>
+        <w:t xml:space="preserve"> that OpenPose achieved higher accuracy than other lighter models in multi person scenarios at the cost of computing power. OpenPose has a notable limitation on CPU performance falling below 15-20 FPS and lack of temporal smoothing features. In a piano setting the lack of temporal smoothing might cause keypress false flags which directly entails accuracy reduction.</w:t>
       </w:r>
     </w:p>
     <w:p>
@@ -4386,7 +4372,7 @@
           <w:noProof/>
         </w:rPr>
         <w:drawing>
-          <wp:inline distT="0" distB="0" distL="0" distR="0" wp14:anchorId="53853E7A" wp14:editId="446FD58A">
+          <wp:inline distT="0" distB="0" distL="0" distR="0" wp14:anchorId="53853E7A" wp14:editId="45CD5A40">
             <wp:extent cx="4794636" cy="2397318"/>
             <wp:effectExtent l="0" t="0" r="6350" b="3175"/>
             <wp:docPr id="751281080" name="Picture 1" descr="CTK-2400 | Standard Keyboards | Electronic Musical Instruments | CASIO"/>
@@ -4403,7 +4389,7 @@
                     </pic:cNvPicPr>
                   </pic:nvPicPr>
                   <pic:blipFill>
-                    <a:blip r:embed="rId8" cstate="print">
+                    <a:blip r:embed="rId9" cstate="print">
                       <a:extLst>
                         <a:ext uri="{28A0092B-C50C-407E-A947-70E740481C1C}">
                           <a14:useLocalDpi xmlns:a14="http://schemas.microsoft.com/office/drawing/2010/main" val="0"/>
@@ -4465,7 +4451,7 @@
         </w:rPr>
         <w:lastRenderedPageBreak/>
         <w:drawing>
-          <wp:inline distT="0" distB="0" distL="0" distR="0" wp14:anchorId="0754C8E7" wp14:editId="63C62B16">
+          <wp:inline distT="0" distB="0" distL="0" distR="0" wp14:anchorId="0754C8E7" wp14:editId="02E5D29C">
             <wp:extent cx="2442069" cy="2472856"/>
             <wp:effectExtent l="0" t="0" r="0" b="3810"/>
             <wp:docPr id="1256679988" name="Picture 7" descr="NiceTQ 10FT USB2.0 PC Connect CABLE CORD FOR Casio CTK-2400 CTK-4400 CTK-6200  61-key keyboard : Amazon.ca: Electronics"/>
@@ -4482,7 +4468,7 @@
                     </pic:cNvPicPr>
                   </pic:nvPicPr>
                   <pic:blipFill>
-                    <a:blip r:embed="rId9" cstate="print">
+                    <a:blip r:embed="rId10" cstate="print">
                       <a:extLst>
                         <a:ext uri="{28A0092B-C50C-407E-A947-70E740481C1C}">
                           <a14:useLocalDpi xmlns:a14="http://schemas.microsoft.com/office/drawing/2010/main" val="0"/>
@@ -4618,7 +4604,7 @@
                     </pic:cNvPicPr>
                   </pic:nvPicPr>
                   <pic:blipFill>
-                    <a:blip r:embed="rId10" cstate="print">
+                    <a:blip r:embed="rId11" cstate="print">
                       <a:extLst>
                         <a:ext uri="{28A0092B-C50C-407E-A947-70E740481C1C}">
                           <a14:useLocalDpi xmlns:a14="http://schemas.microsoft.com/office/drawing/2010/main" val="0"/>
@@ -4672,7 +4658,7 @@
                     </pic:cNvPicPr>
                   </pic:nvPicPr>
                   <pic:blipFill>
-                    <a:blip r:embed="rId11" cstate="print">
+                    <a:blip r:embed="rId12" cstate="print">
                       <a:extLst>
                         <a:ext uri="{28A0092B-C50C-407E-A947-70E740481C1C}">
                           <a14:useLocalDpi xmlns:a14="http://schemas.microsoft.com/office/drawing/2010/main" val="0"/>
@@ -4818,7 +4804,7 @@
                     </pic:cNvPicPr>
                   </pic:nvPicPr>
                   <pic:blipFill>
-                    <a:blip r:embed="rId12" cstate="print">
+                    <a:blip r:embed="rId13" cstate="print">
                       <a:extLst>
                         <a:ext uri="{28A0092B-C50C-407E-A947-70E740481C1C}">
                           <a14:useLocalDpi xmlns:a14="http://schemas.microsoft.com/office/drawing/2010/main" val="0"/>
@@ -5001,7 +4987,7 @@
                     </pic:cNvPicPr>
                   </pic:nvPicPr>
                   <pic:blipFill>
-                    <a:blip r:embed="rId13">
+                    <a:blip r:embed="rId14">
                       <a:extLst>
                         <a:ext uri="{28A0092B-C50C-407E-A947-70E740481C1C}">
                           <a14:useLocalDpi xmlns:a14="http://schemas.microsoft.com/office/drawing/2010/main" val="0"/>
@@ -5951,21 +5937,7 @@
         <w:rPr>
           <w:rFonts w:ascii="Arial" w:hAnsi="Arial" w:cs="Arial"/>
         </w:rPr>
-        <w:t xml:space="preserve">contribution for the </w:t>
-      </w:r>
-      <w:proofErr w:type="gramStart"/>
-      <w:r>
-        <w:rPr>
-          <w:rFonts w:ascii="Arial" w:hAnsi="Arial" w:cs="Arial"/>
-        </w:rPr>
-        <w:t>opensource</w:t>
-      </w:r>
-      <w:proofErr w:type="gramEnd"/>
-      <w:r>
-        <w:rPr>
-          <w:rFonts w:ascii="Arial" w:hAnsi="Arial" w:cs="Arial"/>
-        </w:rPr>
-        <w:t xml:space="preserve"> community </w:t>
+        <w:t xml:space="preserve">contribution for the opensource community </w:t>
       </w:r>
       <w:r>
         <w:rPr>
@@ -6002,7 +5974,7 @@
                     <pic:cNvPicPr/>
                   </pic:nvPicPr>
                   <pic:blipFill>
-                    <a:blip r:embed="rId14"/>
+                    <a:blip r:embed="rId15"/>
                     <a:stretch>
                       <a:fillRect/>
                     </a:stretch>
@@ -6366,6 +6338,172 @@
           <w:rFonts w:ascii="Arial" w:hAnsi="Arial" w:cs="Arial"/>
         </w:rPr>
       </w:pPr>
+      <w:r>
+        <w:rPr>
+          <w:rFonts w:ascii="Arial" w:hAnsi="Arial" w:cs="Arial"/>
+        </w:rPr>
+        <w:t xml:space="preserve">Setting up the data collection pipeline from an upwards angle with almost ninety degree view is the initial setup for </w:t>
+      </w:r>
+      <w:r>
+        <w:rPr>
+          <w:rFonts w:ascii="Arial" w:hAnsi="Arial" w:cs="Arial"/>
+        </w:rPr>
+        <w:t>open-source</w:t>
+      </w:r>
+      <w:r>
+        <w:rPr>
+          <w:rFonts w:ascii="Arial" w:hAnsi="Arial" w:cs="Arial"/>
+        </w:rPr>
+        <w:t xml:space="preserve"> models to easily track finger movement.</w:t>
+      </w:r>
+      <w:r>
+        <w:rPr>
+          <w:rFonts w:ascii="Arial" w:hAnsi="Arial" w:cs="Arial"/>
+        </w:rPr>
+        <w:tab/>
+      </w:r>
+    </w:p>
+    <w:p>
+      <w:pPr>
+        <w:jc w:val="center"/>
+        <w:rPr>
+          <w:rFonts w:ascii="Arial" w:hAnsi="Arial" w:cs="Arial"/>
+        </w:rPr>
+      </w:pPr>
+      <w:r>
+        <w:rPr>
+          <w:rFonts w:ascii="Arial" w:hAnsi="Arial" w:cs="Arial"/>
+          <w:noProof/>
+        </w:rPr>
+        <w:drawing>
+          <wp:inline distT="0" distB="0" distL="0" distR="0" wp14:anchorId="0259857A" wp14:editId="07E5B6F4">
+            <wp:extent cx="2159092" cy="4667098"/>
+            <wp:effectExtent l="19050" t="19050" r="12700" b="19685"/>
+            <wp:docPr id="2089651436" name="Picture 1"/>
+            <wp:cNvGraphicFramePr>
+              <a:graphicFrameLocks xmlns:a="http://schemas.openxmlformats.org/drawingml/2006/main" noChangeAspect="1"/>
+            </wp:cNvGraphicFramePr>
+            <a:graphic xmlns:a="http://schemas.openxmlformats.org/drawingml/2006/main">
+              <a:graphicData uri="http://schemas.openxmlformats.org/drawingml/2006/picture">
+                <pic:pic xmlns:pic="http://schemas.openxmlformats.org/drawingml/2006/picture">
+                  <pic:nvPicPr>
+                    <pic:cNvPr id="0" name="Picture 1"/>
+                    <pic:cNvPicPr>
+                      <a:picLocks noChangeAspect="1" noChangeArrowheads="1"/>
+                    </pic:cNvPicPr>
+                  </pic:nvPicPr>
+                  <pic:blipFill>
+                    <a:blip r:embed="rId16">
+                      <a:extLst>
+                        <a:ext uri="{28A0092B-C50C-407E-A947-70E740481C1C}">
+                          <a14:useLocalDpi xmlns:a14="http://schemas.microsoft.com/office/drawing/2010/main" val="0"/>
+                        </a:ext>
+                      </a:extLst>
+                    </a:blip>
+                    <a:srcRect/>
+                    <a:stretch>
+                      <a:fillRect/>
+                    </a:stretch>
+                  </pic:blipFill>
+                  <pic:spPr bwMode="auto">
+                    <a:xfrm>
+                      <a:off x="0" y="0"/>
+                      <a:ext cx="2159092" cy="4667098"/>
+                    </a:xfrm>
+                    <a:prstGeom prst="rect">
+                      <a:avLst/>
+                    </a:prstGeom>
+                    <a:noFill/>
+                    <a:ln>
+                      <a:solidFill>
+                        <a:schemeClr val="tx1"/>
+                      </a:solidFill>
+                    </a:ln>
+                  </pic:spPr>
+                </pic:pic>
+              </a:graphicData>
+            </a:graphic>
+          </wp:inline>
+        </w:drawing>
+      </w:r>
+      <w:r>
+        <w:rPr>
+          <w:rFonts w:ascii="Arial" w:hAnsi="Arial" w:cs="Arial"/>
+          <w:noProof/>
+        </w:rPr>
+        <w:drawing>
+          <wp:inline distT="0" distB="0" distL="0" distR="0" wp14:anchorId="097680F4" wp14:editId="7D17258E">
+            <wp:extent cx="2151380" cy="4669471"/>
+            <wp:effectExtent l="19050" t="19050" r="20320" b="17145"/>
+            <wp:docPr id="1180750250" name="Picture 3"/>
+            <wp:cNvGraphicFramePr>
+              <a:graphicFrameLocks xmlns:a="http://schemas.openxmlformats.org/drawingml/2006/main" noChangeAspect="1"/>
+            </wp:cNvGraphicFramePr>
+            <a:graphic xmlns:a="http://schemas.openxmlformats.org/drawingml/2006/main">
+              <a:graphicData uri="http://schemas.openxmlformats.org/drawingml/2006/picture">
+                <pic:pic xmlns:pic="http://schemas.openxmlformats.org/drawingml/2006/picture">
+                  <pic:nvPicPr>
+                    <pic:cNvPr id="0" name="Picture 3"/>
+                    <pic:cNvPicPr>
+                      <a:picLocks noChangeAspect="1" noChangeArrowheads="1"/>
+                    </pic:cNvPicPr>
+                  </pic:nvPicPr>
+                  <pic:blipFill>
+                    <a:blip r:embed="rId17">
+                      <a:extLst>
+                        <a:ext uri="{28A0092B-C50C-407E-A947-70E740481C1C}">
+                          <a14:useLocalDpi xmlns:a14="http://schemas.microsoft.com/office/drawing/2010/main" val="0"/>
+                        </a:ext>
+                      </a:extLst>
+                    </a:blip>
+                    <a:srcRect/>
+                    <a:stretch>
+                      <a:fillRect/>
+                    </a:stretch>
+                  </pic:blipFill>
+                  <pic:spPr bwMode="auto">
+                    <a:xfrm>
+                      <a:off x="0" y="0"/>
+                      <a:ext cx="2154921" cy="4677158"/>
+                    </a:xfrm>
+                    <a:prstGeom prst="rect">
+                      <a:avLst/>
+                    </a:prstGeom>
+                    <a:noFill/>
+                    <a:ln>
+                      <a:solidFill>
+                        <a:schemeClr val="tx1"/>
+                      </a:solidFill>
+                    </a:ln>
+                  </pic:spPr>
+                </pic:pic>
+              </a:graphicData>
+            </a:graphic>
+          </wp:inline>
+        </w:drawing>
+      </w:r>
+    </w:p>
+    <w:p>
+      <w:pPr>
+        <w:jc w:val="center"/>
+        <w:rPr>
+          <w:rFonts w:ascii="Arial" w:hAnsi="Arial" w:cs="Arial"/>
+        </w:rPr>
+      </w:pPr>
+      <w:r>
+        <w:rPr>
+          <w:rFonts w:ascii="Arial" w:hAnsi="Arial" w:cs="Arial"/>
+        </w:rPr>
+        <w:t>Fig: Data collection pipeline setup</w:t>
+      </w:r>
+    </w:p>
+    <w:p>
+      <w:pPr>
+        <w:jc w:val="both"/>
+        <w:rPr>
+          <w:rFonts w:ascii="Arial" w:hAnsi="Arial" w:cs="Arial"/>
+        </w:rPr>
+      </w:pPr>
     </w:p>
     <w:p>
       <w:pPr>
@@ -6385,6 +6523,164 @@
       <w:bookmarkEnd w:id="13"/>
     </w:p>
     <w:p>
+      <w:r>
+        <w:t xml:space="preserve">During development, a critical methodological limitation was identified in standard MJMPE computation: using 2D Euclidean distance to the key centroid for finger identification </w:t>
+      </w:r>
+      <w:r>
+        <w:lastRenderedPageBreak/>
+        <w:t>introduces a systematic bias, as fingers of different lengths naturally contact the key at different depths along the y-axis. This means a shorter finger (e.g. the pinky) playing a note correctly may be at a greater y-distance from the centroid than an adjacent longer finger that is not pressing the key, causing the wrong finger to be selected and the error to be artificially inflated.</w:t>
+      </w:r>
+    </w:p>
+    <w:p>
+      <w:r>
+        <w:t>To address this, two corrections were implemented: (1) finger identification was changed from 2D centroid proximity to perspective-warped polygon containment — the finger whose tip lies within the key's physical bounding polygon is selected as the playing finger, regardless of depth along the key; and (2) the error metric was changed from 2D Euclidean distance to horizontal-only displacement (|</w:t>
+      </w:r>
+      <w:proofErr w:type="spellStart"/>
+      <w:r>
+        <w:t>tip_x</w:t>
+      </w:r>
+      <w:proofErr w:type="spellEnd"/>
+      <w:r>
+        <w:t xml:space="preserve"> − </w:t>
+      </w:r>
+      <w:proofErr w:type="spellStart"/>
+      <w:r>
+        <w:t>key_cx</w:t>
+      </w:r>
+      <w:proofErr w:type="spellEnd"/>
+      <w:r>
+        <w:t>|), removing the confound introduced by natural variation in finger contact depth.</w:t>
+      </w:r>
+    </w:p>
+    <w:p>
+      <w:r>
+        <w:t xml:space="preserve">Additionally, a perspective </w:t>
+      </w:r>
+      <w:proofErr w:type="spellStart"/>
+      <w:r>
+        <w:t>homography</w:t>
+      </w:r>
+      <w:proofErr w:type="spellEnd"/>
+      <w:r>
+        <w:t xml:space="preserve"> calibration was added to account for camera angle, as overhead tripod placement rarely produces a perfectly orthogonal view. The key overlay can be warped to a quadrilateral by dragging four corner handles, with a </w:t>
+      </w:r>
+      <w:proofErr w:type="spellStart"/>
+      <w:r>
+        <w:t>homography</w:t>
+      </w:r>
+      <w:proofErr w:type="spellEnd"/>
+      <w:r>
+        <w:t xml:space="preserve"> matrix computed via cv2.getPerspectiveTransform mapping the flat canonical layout to the real-world trapezoidal view. All key </w:t>
+      </w:r>
+      <w:proofErr w:type="spellStart"/>
+      <w:r>
+        <w:t>centre</w:t>
+      </w:r>
+      <w:proofErr w:type="spellEnd"/>
+      <w:r>
+        <w:t xml:space="preserve"> positions and polygon boundaries are then derived from this warped coordinate system.</w:t>
+      </w:r>
+    </w:p>
+    <w:p/>
+    <w:p>
+      <w:pPr>
+        <w:jc w:val="both"/>
+        <w:rPr>
+          <w:rFonts w:ascii="Arial" w:hAnsi="Arial" w:cs="Arial"/>
+        </w:rPr>
+      </w:pPr>
+      <w:r>
+        <w:rPr>
+          <w:rFonts w:ascii="Arial" w:hAnsi="Arial" w:cs="Arial"/>
+        </w:rPr>
+        <w:t xml:space="preserve">* project timeline </w:t>
+      </w:r>
+    </w:p>
+    <w:p>
+      <w:pPr>
+        <w:jc w:val="both"/>
+        <w:rPr>
+          <w:rFonts w:ascii="Arial" w:hAnsi="Arial" w:cs="Arial"/>
+        </w:rPr>
+      </w:pPr>
+      <w:r>
+        <w:rPr>
+          <w:rFonts w:ascii="Arial" w:hAnsi="Arial" w:cs="Arial"/>
+        </w:rPr>
+        <w:t>* task sheet</w:t>
+      </w:r>
+    </w:p>
+    <w:p>
+      <w:pPr>
+        <w:jc w:val="both"/>
+        <w:rPr>
+          <w:rFonts w:ascii="Arial" w:hAnsi="Arial" w:cs="Arial"/>
+        </w:rPr>
+      </w:pPr>
+      <w:r>
+        <w:rPr>
+          <w:rFonts w:ascii="Arial" w:hAnsi="Arial" w:cs="Arial"/>
+        </w:rPr>
+        <w:t xml:space="preserve"> - </w:t>
+      </w:r>
+      <w:proofErr w:type="spellStart"/>
+      <w:r>
+        <w:rPr>
+          <w:rFonts w:ascii="Arial" w:hAnsi="Arial" w:cs="Arial"/>
+        </w:rPr>
+        <w:t>gantt</w:t>
+      </w:r>
+      <w:proofErr w:type="spellEnd"/>
+      <w:r>
+        <w:rPr>
+          <w:rFonts w:ascii="Arial" w:hAnsi="Arial" w:cs="Arial"/>
+        </w:rPr>
+        <w:t xml:space="preserve"> chart </w:t>
+      </w:r>
+    </w:p>
+    <w:p>
+      <w:pPr>
+        <w:jc w:val="both"/>
+        <w:rPr>
+          <w:rFonts w:ascii="Arial" w:hAnsi="Arial" w:cs="Arial"/>
+        </w:rPr>
+      </w:pPr>
+      <w:r>
+        <w:rPr>
+          <w:rFonts w:ascii="Arial" w:hAnsi="Arial" w:cs="Arial"/>
+        </w:rPr>
+        <w:t xml:space="preserve">-resource sheet </w:t>
+      </w:r>
+    </w:p>
+    <w:p>
+      <w:pPr>
+        <w:jc w:val="both"/>
+        <w:rPr>
+          <w:rFonts w:ascii="Arial" w:hAnsi="Arial" w:cs="Arial"/>
+        </w:rPr>
+      </w:pPr>
+      <w:r>
+        <w:rPr>
+          <w:rFonts w:ascii="Arial" w:hAnsi="Arial" w:cs="Arial"/>
+        </w:rPr>
+        <w:t xml:space="preserve">- </w:t>
+      </w:r>
+      <w:proofErr w:type="spellStart"/>
+      <w:r>
+        <w:rPr>
+          <w:rFonts w:ascii="Arial" w:hAnsi="Arial" w:cs="Arial"/>
+        </w:rPr>
+        <w:t>github</w:t>
+      </w:r>
+      <w:proofErr w:type="spellEnd"/>
+      <w:r>
+        <w:rPr>
+          <w:rFonts w:ascii="Arial" w:hAnsi="Arial" w:cs="Arial"/>
+        </w:rPr>
+        <w:t xml:space="preserve"> </w:t>
+      </w:r>
+    </w:p>
+    <w:p>
       <w:pPr>
         <w:jc w:val="both"/>
         <w:rPr>
@@ -6397,19 +6693,19 @@
         </w:rPr>
         <w:t xml:space="preserve">* </w:t>
       </w:r>
-      <w:proofErr w:type="gramStart"/>
-      <w:r>
-        <w:rPr>
-          <w:rFonts w:ascii="Arial" w:hAnsi="Arial" w:cs="Arial"/>
-        </w:rPr>
-        <w:t>project</w:t>
-      </w:r>
-      <w:proofErr w:type="gramEnd"/>
-      <w:r>
-        <w:rPr>
-          <w:rFonts w:ascii="Arial" w:hAnsi="Arial" w:cs="Arial"/>
-        </w:rPr>
-        <w:t xml:space="preserve"> timeline </w:t>
+      <w:proofErr w:type="spellStart"/>
+      <w:r>
+        <w:rPr>
+          <w:rFonts w:ascii="Arial" w:hAnsi="Arial" w:cs="Arial"/>
+        </w:rPr>
+        <w:t>erd</w:t>
+      </w:r>
+      <w:proofErr w:type="spellEnd"/>
+      <w:r>
+        <w:rPr>
+          <w:rFonts w:ascii="Arial" w:hAnsi="Arial" w:cs="Arial"/>
+        </w:rPr>
+        <w:t xml:space="preserve"> if necessary</w:t>
       </w:r>
     </w:p>
     <w:p>
@@ -6425,82 +6721,134 @@
         </w:rPr>
         <w:t xml:space="preserve">* </w:t>
       </w:r>
-      <w:proofErr w:type="gramStart"/>
-      <w:r>
-        <w:rPr>
-          <w:rFonts w:ascii="Arial" w:hAnsi="Arial" w:cs="Arial"/>
-        </w:rPr>
-        <w:t>task</w:t>
-      </w:r>
-      <w:proofErr w:type="gramEnd"/>
-      <w:r>
-        <w:rPr>
-          <w:rFonts w:ascii="Arial" w:hAnsi="Arial" w:cs="Arial"/>
-        </w:rPr>
-        <w:t xml:space="preserve"> sheet</w:t>
-      </w:r>
-    </w:p>
-    <w:p>
-      <w:pPr>
-        <w:jc w:val="both"/>
-        <w:rPr>
-          <w:rFonts w:ascii="Arial" w:hAnsi="Arial" w:cs="Arial"/>
-        </w:rPr>
-      </w:pPr>
-      <w:r>
-        <w:rPr>
-          <w:rFonts w:ascii="Arial" w:hAnsi="Arial" w:cs="Arial"/>
-        </w:rPr>
-        <w:t xml:space="preserve"> - </w:t>
-      </w:r>
       <w:proofErr w:type="spellStart"/>
       <w:r>
         <w:rPr>
           <w:rFonts w:ascii="Arial" w:hAnsi="Arial" w:cs="Arial"/>
         </w:rPr>
-        <w:t>gantt</w:t>
+        <w:t>eerd</w:t>
       </w:r>
       <w:proofErr w:type="spellEnd"/>
       <w:r>
         <w:rPr>
           <w:rFonts w:ascii="Arial" w:hAnsi="Arial" w:cs="Arial"/>
         </w:rPr>
-        <w:t xml:space="preserve"> chart </w:t>
-      </w:r>
-    </w:p>
-    <w:p>
-      <w:pPr>
-        <w:jc w:val="both"/>
-        <w:rPr>
-          <w:rFonts w:ascii="Arial" w:hAnsi="Arial" w:cs="Arial"/>
-        </w:rPr>
-      </w:pPr>
-      <w:r>
-        <w:rPr>
-          <w:rFonts w:ascii="Arial" w:hAnsi="Arial" w:cs="Arial"/>
-        </w:rPr>
-        <w:t xml:space="preserve">-resource sheet </w:t>
-      </w:r>
-    </w:p>
-    <w:p>
-      <w:pPr>
-        <w:jc w:val="both"/>
-        <w:rPr>
-          <w:rFonts w:ascii="Arial" w:hAnsi="Arial" w:cs="Arial"/>
-        </w:rPr>
-      </w:pPr>
-      <w:r>
-        <w:rPr>
-          <w:rFonts w:ascii="Arial" w:hAnsi="Arial" w:cs="Arial"/>
-        </w:rPr>
-        <w:t xml:space="preserve">- </w:t>
+        <w:t xml:space="preserve"> if necessary</w:t>
+      </w:r>
+    </w:p>
+    <w:p>
+      <w:pPr>
+        <w:jc w:val="both"/>
+        <w:rPr>
+          <w:rFonts w:ascii="Arial" w:hAnsi="Arial" w:cs="Arial"/>
+        </w:rPr>
+      </w:pPr>
+      <w:r>
+        <w:rPr>
+          <w:rFonts w:ascii="Arial" w:hAnsi="Arial" w:cs="Arial"/>
+        </w:rPr>
+        <w:t>* use case requirement catalog (jpeg file)</w:t>
+      </w:r>
+    </w:p>
+    <w:p>
+      <w:pPr>
+        <w:jc w:val="both"/>
+        <w:rPr>
+          <w:rFonts w:ascii="Arial" w:hAnsi="Arial" w:cs="Arial"/>
+        </w:rPr>
+      </w:pPr>
+    </w:p>
+    <w:p>
+      <w:pPr>
+        <w:pStyle w:val="Heading1"/>
+        <w:jc w:val="both"/>
+        <w:rPr>
+          <w:rFonts w:ascii="Arial" w:hAnsi="Arial" w:cs="Arial"/>
+        </w:rPr>
+      </w:pPr>
+      <w:bookmarkStart w:id="14" w:name="_Toc223284989"/>
+      <w:r>
+        <w:rPr>
+          <w:rFonts w:ascii="Arial" w:hAnsi="Arial" w:cs="Arial"/>
+        </w:rPr>
+        <w:t>I</w:t>
+      </w:r>
+      <w:r>
+        <w:rPr>
+          <w:rFonts w:ascii="Arial" w:hAnsi="Arial" w:cs="Arial"/>
+        </w:rPr>
+        <w:t>nstallation guideline</w:t>
+      </w:r>
+      <w:bookmarkEnd w:id="14"/>
+      <w:r>
+        <w:rPr>
+          <w:rFonts w:ascii="Arial" w:hAnsi="Arial" w:cs="Arial"/>
+        </w:rPr>
+        <w:t xml:space="preserve"> </w:t>
+      </w:r>
+    </w:p>
+    <w:p>
+      <w:pPr>
+        <w:jc w:val="both"/>
+        <w:rPr>
+          <w:rFonts w:ascii="Arial" w:hAnsi="Arial" w:cs="Arial"/>
+        </w:rPr>
+      </w:pPr>
+      <w:r>
+        <w:rPr>
+          <w:rFonts w:ascii="Arial" w:hAnsi="Arial" w:cs="Arial"/>
+        </w:rPr>
+        <w:t xml:space="preserve">Python 3.10+ is required for this </w:t>
+      </w:r>
+      <w:r>
+        <w:rPr>
+          <w:rFonts w:ascii="Arial" w:hAnsi="Arial" w:cs="Arial"/>
+        </w:rPr>
+        <w:t>system, installation can be done from the Microsoft store or python website</w:t>
+      </w:r>
+      <w:r>
+        <w:rPr>
+          <w:rFonts w:ascii="Arial" w:hAnsi="Arial" w:cs="Arial"/>
+        </w:rPr>
+        <w:t xml:space="preserve">. The requirements.txt </w:t>
+      </w:r>
+      <w:r>
+        <w:rPr>
+          <w:rFonts w:ascii="Arial" w:hAnsi="Arial" w:cs="Arial"/>
+        </w:rPr>
+        <w:t>include</w:t>
+      </w:r>
+      <w:r>
+        <w:rPr>
+          <w:rFonts w:ascii="Arial" w:hAnsi="Arial" w:cs="Arial"/>
+        </w:rPr>
+        <w:t xml:space="preserve"> all the </w:t>
+      </w:r>
+      <w:r>
+        <w:rPr>
+          <w:rFonts w:ascii="Arial" w:hAnsi="Arial" w:cs="Arial"/>
+        </w:rPr>
+        <w:t xml:space="preserve">required frameworks and libraries. </w:t>
+      </w:r>
+      <w:r>
+        <w:rPr>
+          <w:rFonts w:ascii="Arial" w:hAnsi="Arial" w:cs="Arial"/>
+        </w:rPr>
+        <w:t xml:space="preserve">Python virtual environment should be used to fix any dependencies issues as many </w:t>
+      </w:r>
+      <w:r>
+        <w:rPr>
+          <w:rFonts w:ascii="Arial" w:hAnsi="Arial" w:cs="Arial"/>
+        </w:rPr>
+        <w:lastRenderedPageBreak/>
+        <w:t xml:space="preserve">libraries aren’t supported on the latest version the command python -m </w:t>
       </w:r>
       <w:proofErr w:type="spellStart"/>
       <w:r>
         <w:rPr>
           <w:rFonts w:ascii="Arial" w:hAnsi="Arial" w:cs="Arial"/>
         </w:rPr>
-        <w:t>github</w:t>
+        <w:t>venv</w:t>
       </w:r>
       <w:proofErr w:type="spellEnd"/>
       <w:r>
@@ -6509,93 +6857,85 @@
         </w:rPr>
         <w:t xml:space="preserve"> </w:t>
       </w:r>
-    </w:p>
-    <w:p>
-      <w:pPr>
-        <w:jc w:val="both"/>
-        <w:rPr>
-          <w:rFonts w:ascii="Arial" w:hAnsi="Arial" w:cs="Arial"/>
-        </w:rPr>
-      </w:pPr>
-      <w:r>
-        <w:rPr>
-          <w:rFonts w:ascii="Arial" w:hAnsi="Arial" w:cs="Arial"/>
-        </w:rPr>
-        <w:t xml:space="preserve">* </w:t>
+      <w:r>
+        <w:rPr>
+          <w:rFonts w:ascii="Arial" w:hAnsi="Arial" w:cs="Arial"/>
+        </w:rPr>
+        <w:t>&lt;environment name&gt; without the &lt;&gt; can be used to initialize via terminal</w:t>
+      </w:r>
+      <w:r>
+        <w:rPr>
+          <w:rFonts w:ascii="Arial" w:hAnsi="Arial" w:cs="Arial"/>
+        </w:rPr>
+        <w:t>. After activating the script using</w:t>
+      </w:r>
+      <w:r>
+        <w:rPr>
+          <w:rFonts w:ascii="Arial" w:hAnsi="Arial" w:cs="Arial"/>
+        </w:rPr>
+        <w:t xml:space="preserve"> </w:t>
       </w:r>
       <w:proofErr w:type="spellStart"/>
-      <w:proofErr w:type="gramStart"/>
-      <w:r>
-        <w:rPr>
-          <w:rFonts w:ascii="Arial" w:hAnsi="Arial" w:cs="Arial"/>
-        </w:rPr>
-        <w:t>erd</w:t>
+      <w:r>
+        <w:rPr>
+          <w:rFonts w:ascii="Arial" w:hAnsi="Arial" w:cs="Arial"/>
+        </w:rPr>
+        <w:t>venv</w:t>
       </w:r>
       <w:proofErr w:type="spellEnd"/>
-      <w:proofErr w:type="gramEnd"/>
-      <w:r>
-        <w:rPr>
-          <w:rFonts w:ascii="Arial" w:hAnsi="Arial" w:cs="Arial"/>
-        </w:rPr>
-        <w:t xml:space="preserve"> if necessary</w:t>
-      </w:r>
-    </w:p>
-    <w:p>
-      <w:pPr>
-        <w:jc w:val="both"/>
-        <w:rPr>
-          <w:rFonts w:ascii="Arial" w:hAnsi="Arial" w:cs="Arial"/>
-        </w:rPr>
-      </w:pPr>
-      <w:r>
-        <w:rPr>
-          <w:rFonts w:ascii="Arial" w:hAnsi="Arial" w:cs="Arial"/>
-        </w:rPr>
-        <w:t xml:space="preserve">* </w:t>
-      </w:r>
-      <w:proofErr w:type="spellStart"/>
-      <w:proofErr w:type="gramStart"/>
-      <w:r>
-        <w:rPr>
-          <w:rFonts w:ascii="Arial" w:hAnsi="Arial" w:cs="Arial"/>
-        </w:rPr>
-        <w:t>eerd</w:t>
-      </w:r>
-      <w:proofErr w:type="spellEnd"/>
-      <w:proofErr w:type="gramEnd"/>
-      <w:r>
-        <w:rPr>
-          <w:rFonts w:ascii="Arial" w:hAnsi="Arial" w:cs="Arial"/>
-        </w:rPr>
-        <w:t xml:space="preserve"> if necessary</w:t>
-      </w:r>
-    </w:p>
-    <w:p>
-      <w:pPr>
-        <w:jc w:val="both"/>
-        <w:rPr>
-          <w:rFonts w:ascii="Arial" w:hAnsi="Arial" w:cs="Arial"/>
-        </w:rPr>
-      </w:pPr>
-      <w:r>
-        <w:rPr>
-          <w:rFonts w:ascii="Arial" w:hAnsi="Arial" w:cs="Arial"/>
-        </w:rPr>
-        <w:t xml:space="preserve">* </w:t>
-      </w:r>
-      <w:proofErr w:type="gramStart"/>
-      <w:r>
-        <w:rPr>
-          <w:rFonts w:ascii="Arial" w:hAnsi="Arial" w:cs="Arial"/>
-        </w:rPr>
-        <w:t>use</w:t>
-      </w:r>
-      <w:proofErr w:type="gramEnd"/>
-      <w:r>
-        <w:rPr>
-          <w:rFonts w:ascii="Arial" w:hAnsi="Arial" w:cs="Arial"/>
-        </w:rPr>
-        <w:t xml:space="preserve"> case requirement catalog (jpeg file)</w:t>
+      <w:r>
+        <w:rPr>
+          <w:rFonts w:ascii="Arial" w:hAnsi="Arial" w:cs="Arial"/>
+        </w:rPr>
+        <w:t>\Scripts\activate</w:t>
+      </w:r>
+      <w:r>
+        <w:rPr>
+          <w:rFonts w:ascii="Arial" w:hAnsi="Arial" w:cs="Arial"/>
+        </w:rPr>
+        <w:t xml:space="preserve"> the requirements.txt has all the required </w:t>
+      </w:r>
+      <w:r>
+        <w:rPr>
+          <w:rFonts w:ascii="Arial" w:hAnsi="Arial" w:cs="Arial"/>
+        </w:rPr>
+        <w:t>sources, the</w:t>
+      </w:r>
+      <w:r>
+        <w:rPr>
+          <w:rFonts w:ascii="Arial" w:hAnsi="Arial" w:cs="Arial"/>
+        </w:rPr>
+        <w:t xml:space="preserve"> command </w:t>
+      </w:r>
+      <w:r>
+        <w:rPr>
+          <w:rFonts w:ascii="Arial" w:hAnsi="Arial" w:cs="Arial"/>
+        </w:rPr>
+        <w:t>pip install -r requirements.txt can be used to install</w:t>
+      </w:r>
+      <w:r>
+        <w:rPr>
+          <w:rFonts w:ascii="Arial" w:hAnsi="Arial" w:cs="Arial"/>
+        </w:rPr>
+        <w:t xml:space="preserve"> all python dependencies</w:t>
+      </w:r>
+      <w:r>
+        <w:rPr>
+          <w:rFonts w:ascii="Arial" w:hAnsi="Arial" w:cs="Arial"/>
+        </w:rPr>
+        <w:t xml:space="preserve"> via terminal</w:t>
+      </w:r>
+      <w:r>
+        <w:rPr>
+          <w:rFonts w:ascii="Arial" w:hAnsi="Arial" w:cs="Arial"/>
+        </w:rPr>
+        <w:t>.</w:t>
+      </w:r>
+      <w:r>
+        <w:rPr>
+          <w:rFonts w:ascii="Arial" w:hAnsi="Arial" w:cs="Arial"/>
+        </w:rPr>
+        <w:t xml:space="preserve"> The full guide will be included in the Installation guidelines file.</w:t>
       </w:r>
     </w:p>
     <w:p>
@@ -6614,187 +6954,6 @@
           <w:rFonts w:ascii="Arial" w:hAnsi="Arial" w:cs="Arial"/>
         </w:rPr>
       </w:pPr>
-      <w:bookmarkStart w:id="14" w:name="_Toc223284989"/>
-      <w:r>
-        <w:rPr>
-          <w:rFonts w:ascii="Arial" w:hAnsi="Arial" w:cs="Arial"/>
-        </w:rPr>
-        <w:t>I</w:t>
-      </w:r>
-      <w:r>
-        <w:rPr>
-          <w:rFonts w:ascii="Arial" w:hAnsi="Arial" w:cs="Arial"/>
-        </w:rPr>
-        <w:t>nstallation guideline</w:t>
-      </w:r>
-      <w:bookmarkEnd w:id="14"/>
-      <w:r>
-        <w:rPr>
-          <w:rFonts w:ascii="Arial" w:hAnsi="Arial" w:cs="Arial"/>
-        </w:rPr>
-        <w:t xml:space="preserve"> </w:t>
-      </w:r>
-    </w:p>
-    <w:p>
-      <w:pPr>
-        <w:jc w:val="both"/>
-        <w:rPr>
-          <w:rFonts w:ascii="Arial" w:hAnsi="Arial" w:cs="Arial"/>
-        </w:rPr>
-      </w:pPr>
-      <w:r>
-        <w:rPr>
-          <w:rFonts w:ascii="Arial" w:hAnsi="Arial" w:cs="Arial"/>
-        </w:rPr>
-        <w:t xml:space="preserve">Python 3.10+ is required for this </w:t>
-      </w:r>
-      <w:r>
-        <w:rPr>
-          <w:rFonts w:ascii="Arial" w:hAnsi="Arial" w:cs="Arial"/>
-        </w:rPr>
-        <w:t>system, installation can be done from the Microsoft store or python website</w:t>
-      </w:r>
-      <w:r>
-        <w:rPr>
-          <w:rFonts w:ascii="Arial" w:hAnsi="Arial" w:cs="Arial"/>
-        </w:rPr>
-        <w:t xml:space="preserve">. The requirements.txt </w:t>
-      </w:r>
-      <w:r>
-        <w:rPr>
-          <w:rFonts w:ascii="Arial" w:hAnsi="Arial" w:cs="Arial"/>
-        </w:rPr>
-        <w:t>include</w:t>
-      </w:r>
-      <w:r>
-        <w:rPr>
-          <w:rFonts w:ascii="Arial" w:hAnsi="Arial" w:cs="Arial"/>
-        </w:rPr>
-        <w:t xml:space="preserve"> all the </w:t>
-      </w:r>
-      <w:r>
-        <w:rPr>
-          <w:rFonts w:ascii="Arial" w:hAnsi="Arial" w:cs="Arial"/>
-        </w:rPr>
-        <w:t xml:space="preserve">required frameworks and libraries. </w:t>
-      </w:r>
-      <w:r>
-        <w:rPr>
-          <w:rFonts w:ascii="Arial" w:hAnsi="Arial" w:cs="Arial"/>
-        </w:rPr>
-        <w:t xml:space="preserve">Python virtual environment should be used to fix any dependencies issues as many libraries aren’t supported on the latest version the command python -m </w:t>
-      </w:r>
-      <w:proofErr w:type="spellStart"/>
-      <w:r>
-        <w:rPr>
-          <w:rFonts w:ascii="Arial" w:hAnsi="Arial" w:cs="Arial"/>
-        </w:rPr>
-        <w:t>venv</w:t>
-      </w:r>
-      <w:proofErr w:type="spellEnd"/>
-      <w:r>
-        <w:rPr>
-          <w:rFonts w:ascii="Arial" w:hAnsi="Arial" w:cs="Arial"/>
-        </w:rPr>
-        <w:t xml:space="preserve"> </w:t>
-      </w:r>
-      <w:r>
-        <w:rPr>
-          <w:rFonts w:ascii="Arial" w:hAnsi="Arial" w:cs="Arial"/>
-        </w:rPr>
-        <w:t>&lt;environment name&gt; without the &lt;&gt; can be used to initialize via terminal</w:t>
-      </w:r>
-      <w:r>
-        <w:rPr>
-          <w:rFonts w:ascii="Arial" w:hAnsi="Arial" w:cs="Arial"/>
-        </w:rPr>
-        <w:t>. After activating the script using</w:t>
-      </w:r>
-      <w:r>
-        <w:rPr>
-          <w:rFonts w:ascii="Arial" w:hAnsi="Arial" w:cs="Arial"/>
-        </w:rPr>
-        <w:t xml:space="preserve"> </w:t>
-      </w:r>
-      <w:proofErr w:type="spellStart"/>
-      <w:r>
-        <w:rPr>
-          <w:rFonts w:ascii="Arial" w:hAnsi="Arial" w:cs="Arial"/>
-        </w:rPr>
-        <w:t>venv</w:t>
-      </w:r>
-      <w:proofErr w:type="spellEnd"/>
-      <w:r>
-        <w:rPr>
-          <w:rFonts w:ascii="Arial" w:hAnsi="Arial" w:cs="Arial"/>
-        </w:rPr>
-        <w:t>\Scripts\activate</w:t>
-      </w:r>
-      <w:r>
-        <w:rPr>
-          <w:rFonts w:ascii="Arial" w:hAnsi="Arial" w:cs="Arial"/>
-        </w:rPr>
-        <w:t xml:space="preserve"> the requirements.txt has all the required </w:t>
-      </w:r>
-      <w:r>
-        <w:rPr>
-          <w:rFonts w:ascii="Arial" w:hAnsi="Arial" w:cs="Arial"/>
-        </w:rPr>
-        <w:t>sources, the</w:t>
-      </w:r>
-      <w:r>
-        <w:rPr>
-          <w:rFonts w:ascii="Arial" w:hAnsi="Arial" w:cs="Arial"/>
-        </w:rPr>
-        <w:t xml:space="preserve"> command </w:t>
-      </w:r>
-      <w:r>
-        <w:rPr>
-          <w:rFonts w:ascii="Arial" w:hAnsi="Arial" w:cs="Arial"/>
-        </w:rPr>
-        <w:t>pip install -r requirements.txt can be used to install</w:t>
-      </w:r>
-      <w:r>
-        <w:rPr>
-          <w:rFonts w:ascii="Arial" w:hAnsi="Arial" w:cs="Arial"/>
-        </w:rPr>
-        <w:t xml:space="preserve"> all python dependencies</w:t>
-      </w:r>
-      <w:r>
-        <w:rPr>
-          <w:rFonts w:ascii="Arial" w:hAnsi="Arial" w:cs="Arial"/>
-        </w:rPr>
-        <w:t xml:space="preserve"> via terminal</w:t>
-      </w:r>
-      <w:r>
-        <w:rPr>
-          <w:rFonts w:ascii="Arial" w:hAnsi="Arial" w:cs="Arial"/>
-        </w:rPr>
-        <w:t>.</w:t>
-      </w:r>
-      <w:r>
-        <w:rPr>
-          <w:rFonts w:ascii="Arial" w:hAnsi="Arial" w:cs="Arial"/>
-        </w:rPr>
-        <w:t xml:space="preserve"> The full guide will be included in the Installation guidelines file.</w:t>
-      </w:r>
-    </w:p>
-    <w:p>
-      <w:pPr>
-        <w:jc w:val="both"/>
-        <w:rPr>
-          <w:rFonts w:ascii="Arial" w:hAnsi="Arial" w:cs="Arial"/>
-        </w:rPr>
-      </w:pPr>
-    </w:p>
-    <w:p>
-      <w:pPr>
-        <w:pStyle w:val="Heading1"/>
-        <w:jc w:val="both"/>
-        <w:rPr>
-          <w:rFonts w:ascii="Arial" w:hAnsi="Arial" w:cs="Arial"/>
-        </w:rPr>
-      </w:pPr>
       <w:bookmarkStart w:id="15" w:name="_Toc223284990"/>
       <w:r>
         <w:rPr>
@@ -6829,22 +6988,7 @@
         <w:rPr>
           <w:rFonts w:ascii="Arial" w:hAnsi="Arial" w:cs="Arial"/>
         </w:rPr>
-        <w:lastRenderedPageBreak/>
-        <w:t xml:space="preserve">2 what new outcome does your research bring out that </w:t>
-      </w:r>
-      <w:proofErr w:type="gramStart"/>
-      <w:r>
-        <w:rPr>
-          <w:rFonts w:ascii="Arial" w:hAnsi="Arial" w:cs="Arial"/>
-        </w:rPr>
-        <w:t>other</w:t>
-      </w:r>
-      <w:proofErr w:type="gramEnd"/>
-      <w:r>
-        <w:rPr>
-          <w:rFonts w:ascii="Arial" w:hAnsi="Arial" w:cs="Arial"/>
-        </w:rPr>
-        <w:t xml:space="preserve"> research lack</w:t>
+        <w:t>2 what new outcome does your research bring out that other research lack</w:t>
       </w:r>
     </w:p>
     <w:p>
@@ -7224,7 +7368,7 @@
       <w:proofErr w:type="spellEnd"/>
     </w:p>
     <w:sectPr>
-      <w:footerReference w:type="default" r:id="rId15"/>
+      <w:footerReference w:type="default" r:id="rId18"/>
       <w:pgSz w:w="12240" w:h="15840"/>
       <w:pgMar w:top="1440" w:right="1440" w:bottom="1440" w:left="1440" w:header="720" w:footer="720" w:gutter="0"/>
       <w:cols w:space="720"/>
@@ -8398,7 +8542,6 @@
   <w:style w:type="character" w:default="1" w:styleId="DefaultParagraphFont">
     <w:name w:val="Default Paragraph Font"/>
     <w:uiPriority w:val="1"/>
-    <w:semiHidden/>
     <w:unhideWhenUsed/>
   </w:style>
   <w:style w:type="table" w:default="1" w:styleId="TableNormal">
@@ -9156,4 +9299,16 @@
     </a:ext>
   </a:extLst>
 </a:theme>
+</file>
+
+<file path=customXml/item1.xml><?xml version="1.0" encoding="utf-8"?>
+<b:Sources xmlns:b="http://schemas.openxmlformats.org/officeDocument/2006/bibliography" xmlns="http://schemas.openxmlformats.org/officeDocument/2006/bibliography" SelectedStyle="\APASixthEditionOfficeOnline.xsl" StyleName="APA" Version="6"/>
+</file>
+
+<file path=customXml/itemProps1.xml><?xml version="1.0" encoding="utf-8"?>
+<ds:datastoreItem xmlns:ds="http://schemas.openxmlformats.org/officeDocument/2006/customXml" ds:itemID="{7E680A2F-0E2B-4C5E-9FA7-1A7EFE0AA72D}">
+  <ds:schemaRefs>
+    <ds:schemaRef ds:uri="http://schemas.openxmlformats.org/officeDocument/2006/bibliography"/>
+  </ds:schemaRefs>
+</ds:datastoreItem>
 </file>
</xml_diff>